<commit_message>
Update LAB 4 and LAB 5
</commit_message>
<xml_diff>
--- a/LAB 4/lab4_1150080092_CNPM2_NguyenThiThanhHien.docx
+++ b/LAB 4/lab4_1150080092_CNPM2_NguyenThiThanhHien.docx
@@ -74,7 +74,7 @@
             <w:sz w:val="26"/>
             <w:szCs w:val="26"/>
           </w:rPr>
-          <w:t>https://youtu.be/0hakvdQIHw8</w:t>
+          <w:t>https://youtu.be/mf3zdj6Cy3I</w:t>
         </w:r>
       </w:hyperlink>
     </w:p>
@@ -1513,25 +1513,7 @@
                 <w:sz w:val="26"/>
                 <w:szCs w:val="26"/>
               </w:rPr>
-              <w:t>00:0C:</w:t>
-            </w:r>
-            <w:proofErr w:type="gramStart"/>
-            <w:r>
-              <w:rPr>
-                <w:rFonts w:ascii="Times New Roman" w:hAnsi="Times New Roman" w:cs="Times New Roman"/>
-                <w:sz w:val="26"/>
-                <w:szCs w:val="26"/>
-              </w:rPr>
-              <w:t>29:FA</w:t>
-            </w:r>
-            <w:proofErr w:type="gramEnd"/>
-            <w:r>
-              <w:rPr>
-                <w:rFonts w:ascii="Times New Roman" w:hAnsi="Times New Roman" w:cs="Times New Roman"/>
-                <w:sz w:val="26"/>
-                <w:szCs w:val="26"/>
-              </w:rPr>
-              <w:t>:DD:2A / VMware</w:t>
+              <w:t>00:0C:29:FA:DD:2A / VMware</w:t>
             </w:r>
           </w:p>
         </w:tc>
@@ -1645,25 +1627,7 @@
                 <w:sz w:val="26"/>
                 <w:szCs w:val="26"/>
               </w:rPr>
-              <w:t>00:0</w:t>
-            </w:r>
-            <w:proofErr w:type="gramStart"/>
-            <w:r>
-              <w:rPr>
-                <w:rFonts w:ascii="Times New Roman" w:hAnsi="Times New Roman" w:cs="Times New Roman"/>
-                <w:sz w:val="26"/>
-                <w:szCs w:val="26"/>
-              </w:rPr>
-              <w:t>C:29:5C:5A:8A</w:t>
-            </w:r>
-            <w:proofErr w:type="gramEnd"/>
-            <w:r>
-              <w:rPr>
-                <w:rFonts w:ascii="Times New Roman" w:hAnsi="Times New Roman" w:cs="Times New Roman"/>
-                <w:sz w:val="26"/>
-                <w:szCs w:val="26"/>
-              </w:rPr>
-              <w:t xml:space="preserve"> / VMware</w:t>
+              <w:t>00:0C:29:5C:5A:8A / VMware</w:t>
             </w:r>
           </w:p>
         </w:tc>
@@ -7574,6 +7538,18 @@
       <w:shd w:val="clear" w:color="auto" w:fill="E1DFDD"/>
     </w:rPr>
   </w:style>
+  <w:style w:type="character" w:styleId="FollowedHyperlink">
+    <w:name w:val="FollowedHyperlink"/>
+    <w:basedOn w:val="DefaultParagraphFont"/>
+    <w:uiPriority w:val="99"/>
+    <w:semiHidden/>
+    <w:unhideWhenUsed/>
+    <w:rsid w:val="003B2F42"/>
+    <w:rPr>
+      <w:color w:val="954F72" w:themeColor="followedHyperlink"/>
+      <w:u w:val="single"/>
+    </w:rPr>
+  </w:style>
 </w:styles>
 </file>
 

</xml_diff>